<commit_message>
fixed docx generation issue
</commit_message>
<xml_diff>
--- a/planet_it_threat_scenario_template.docx
+++ b/planet_it_threat_scenario_template.docx
@@ -2894,6 +2894,101 @@
       </w:r>
     </w:p>
     <w:p/>
+    <w:p>
+      <w:pPr>
+        <w:pStyle w:val="Heading1"/>
+      </w:pPr>
+      <w:r>
+        <w:t>Recommended Follow Up Actions</w:t>
+      </w:r>
+    </w:p>
+    <w:p/>
+    <w:p>
+      <w:pPr>
+        <w:rPr>
+          <w:szCs w:val="20"/>
+          <w:lang w:eastAsia="en-GB"/>
+        </w:rPr>
+      </w:pPr>
+      <w:r>
+        <w:t>This report presents a simulated, theoretical attack scenario intended to identify potential security gaps. It should not be regarded as a definitive or exhaustive assessment of the security controls currently in place at {{ customer_name }}. For a more comprehensive and holistic security review, we recommend engaging with Planet IT to arrange one of the following additional follow on services:</w:t>
+      </w:r>
+    </w:p>
+    <w:p/>
+    <w:p>
+      <w:pPr>
+        <w:pStyle w:val="ListParagraph"/>
+        <w:numPr>
+          <w:ilvl w:val="0"/>
+          <w:numId w:val="6"/>
+        </w:numPr>
+        <w:rPr>
+          <w:szCs w:val="20"/>
+          <w:lang w:eastAsia="en-GB"/>
+        </w:rPr>
+      </w:pPr>
+      <w:r>
+        <w:t>A Security Maturity Assessment</w:t>
+      </w:r>
+    </w:p>
+    <w:p>
+      <w:pPr>
+        <w:pStyle w:val="ListParagraph"/>
+        <w:numPr>
+          <w:ilvl w:val="0"/>
+          <w:numId w:val="6"/>
+        </w:numPr>
+        <w:rPr>
+          <w:szCs w:val="20"/>
+          <w:lang w:eastAsia="en-GB"/>
+        </w:rPr>
+      </w:pPr>
+      <w:r>
+        <w:t>Regular penetration testing</w:t>
+      </w:r>
+    </w:p>
+    <w:p>
+      <w:pPr>
+        <w:pStyle w:val="ListParagraph"/>
+        <w:numPr>
+          <w:ilvl w:val="0"/>
+          <w:numId w:val="6"/>
+        </w:numPr>
+        <w:rPr>
+          <w:szCs w:val="20"/>
+          <w:lang w:eastAsia="en-GB"/>
+        </w:rPr>
+      </w:pPr>
+      <w:r>
+        <w:t>Additional Security Advisory Services</w:t>
+      </w:r>
+    </w:p>
+    <w:p>
+      <w:pPr>
+        <w:rPr>
+          <w:szCs w:val="20"/>
+          <w:lang w:eastAsia="en-GB"/>
+        </w:rPr>
+      </w:pPr>
+    </w:p>
+    <w:p>
+      <w:pPr>
+        <w:rPr>
+          <w:szCs w:val="20"/>
+          <w:lang w:eastAsia="en-GB"/>
+        </w:rPr>
+      </w:pPr>
+      <w:r>
+        <w:rPr>
+          <w:szCs w:val="20"/>
+          <w:lang w:eastAsia="en-GB"/>
+        </w:rPr>
+        <w:t>We work with a number of industry leading partners to deliver these services and will always be able to find a solution that fits your required need when it comes down to additional testing.</w:t>
+      </w:r>
+    </w:p>
+    <w:p/>
+    <w:p/>
+    <w:p/>
     <w:p/>
     <w:p/>
     <w:p/>
@@ -2982,6 +3077,7 @@
           <w:sz w:val="20"/>
           <w:szCs w:val="24"/>
         </w:rPr>
+        <w:lastRenderedPageBreak/>
         <w:t xml:space="preserve">Our </w:t>
       </w:r>
       <w:r>
@@ -3356,6 +3452,7 @@
     <w:p/>
     <w:p>
       <w:r>
+        <w:lastRenderedPageBreak/>
         <w:t xml:space="preserve">Since the beginning, we have built our business on first-class customer service and employing the best people available. We continue that ethos today, constantly building and maintaining our </w:t>
       </w:r>
     </w:p>
@@ -10037,6 +10134,155 @@
 <file path=word/numbering.xml><?xml version="1.0" encoding="utf-8"?>
 <w:numbering xmlns:wpc="http://schemas.microsoft.com/office/word/2010/wordprocessingCanvas" xmlns:cx="http://schemas.microsoft.com/office/drawing/2014/chartex" xmlns:cx1="http://schemas.microsoft.com/office/drawing/2015/9/8/chartex" xmlns:cx2="http://schemas.microsoft.com/office/drawing/2015/10/21/chartex" xmlns:cx3="http://schemas.microsoft.com/office/drawing/2016/5/9/chartex" xmlns:cx4="http://schemas.microsoft.com/office/drawing/2016/5/10/chartex" xmlns:cx5="http://schemas.microsoft.com/office/drawing/2016/5/11/chartex" xmlns:cx6="http://schemas.microsoft.com/office/drawing/2016/5/12/chartex" xmlns:cx7="http://schemas.microsoft.com/office/drawing/2016/5/13/chartex" xmlns:cx8="http://schemas.microsoft.com/office/drawing/2016/5/14/chartex" xmlns:mc="http://schemas.openxmlformats.org/markup-compatibility/2006" xmlns:aink="http://schemas.microsoft.com/office/drawing/2016/ink" xmlns:am3d="http://schemas.microsoft.com/office/drawing/2017/model3d" xmlns:o="urn:schemas-microsoft-com:office:office" xmlns:oel="http://schemas.microsoft.com/office/2019/extlst" xmlns:r="http://schemas.openxmlformats.org/officeDocument/2006/relationships" xmlns:m="http://schemas.openxmlformats.org/officeDocument/2006/math" xmlns:v="urn:schemas-microsoft-com:vml" xmlns:wp14="http://schemas.microsoft.com/office/word/2010/wordprocessingDrawing" xmlns:wp="http://schemas.openxmlformats.org/drawingml/2006/wordprocessingDrawing" xmlns:w10="urn:schemas-microsoft-com:office:word" xmlns:w="http://schemas.openxmlformats.org/wordprocessingml/2006/main" xmlns:w14="http://schemas.microsoft.com/office/word/2010/wordml" xmlns:w15="http://schemas.microsoft.com/office/word/2012/wordml" xmlns:w16cex="http://schemas.microsoft.com/office/word/2018/wordml/cex" xmlns:w16cid="http://schemas.microsoft.com/office/word/2016/wordml/cid" xmlns:w16="http://schemas.microsoft.com/office/word/2018/wordml" xmlns:w16du="http://schemas.microsoft.com/office/word/2023/wordml/word16du" xmlns:w16sdtdh="http://schemas.microsoft.com/office/word/2020/wordml/sdtdatahash" xmlns:w16sdtfl="http://schemas.microsoft.com/office/word/2024/wordml/sdtformatlock" xmlns:w16se="http://schemas.microsoft.com/office/word/2015/wordml/symex" xmlns:wpg="http://schemas.microsoft.com/office/word/2010/wordprocessingGroup" xmlns:wpi="http://schemas.microsoft.com/office/word/2010/wordprocessingInk" xmlns:wne="http://schemas.microsoft.com/office/word/2006/wordml" xmlns:wps="http://schemas.microsoft.com/office/word/2010/wordprocessingShape" mc:Ignorable="w14 w15 w16se w16cid w16 w16cex w16sdtdh w16sdtfl w16du wp14">
   <w:abstractNum w:abstractNumId="0" w15:restartNumberingAfterBreak="0">
+    <w:nsid w:val="136C3D5F"/>
+    <w:multiLevelType w:val="multilevel"/>
+    <w:tmpl w:val="6450DF8A"/>
+    <w:lvl w:ilvl="0">
+      <w:start w:val="1"/>
+      <w:numFmt w:val="bullet"/>
+      <w:lvlText w:val=""/>
+      <w:lvlJc w:val="left"/>
+      <w:pPr>
+        <w:tabs>
+          <w:tab w:val="num" w:pos="720"/>
+        </w:tabs>
+        <w:ind w:left="720" w:hanging="360"/>
+      </w:pPr>
+      <w:rPr>
+        <w:rFonts w:ascii="Symbol" w:hAnsi="Symbol" w:hint="default"/>
+        <w:sz w:val="20"/>
+      </w:rPr>
+    </w:lvl>
+    <w:lvl w:ilvl="1" w:tentative="1">
+      <w:start w:val="1"/>
+      <w:numFmt w:val="bullet"/>
+      <w:lvlText w:val="o"/>
+      <w:lvlJc w:val="left"/>
+      <w:pPr>
+        <w:tabs>
+          <w:tab w:val="num" w:pos="1440"/>
+        </w:tabs>
+        <w:ind w:left="1440" w:hanging="360"/>
+      </w:pPr>
+      <w:rPr>
+        <w:rFonts w:ascii="Courier New" w:hAnsi="Courier New" w:hint="default"/>
+        <w:sz w:val="20"/>
+      </w:rPr>
+    </w:lvl>
+    <w:lvl w:ilvl="2" w:tentative="1">
+      <w:start w:val="1"/>
+      <w:numFmt w:val="bullet"/>
+      <w:lvlText w:val=""/>
+      <w:lvlJc w:val="left"/>
+      <w:pPr>
+        <w:tabs>
+          <w:tab w:val="num" w:pos="2160"/>
+        </w:tabs>
+        <w:ind w:left="2160" w:hanging="360"/>
+      </w:pPr>
+      <w:rPr>
+        <w:rFonts w:ascii="Wingdings" w:hAnsi="Wingdings" w:hint="default"/>
+        <w:sz w:val="20"/>
+      </w:rPr>
+    </w:lvl>
+    <w:lvl w:ilvl="3" w:tentative="1">
+      <w:start w:val="1"/>
+      <w:numFmt w:val="bullet"/>
+      <w:lvlText w:val=""/>
+      <w:lvlJc w:val="left"/>
+      <w:pPr>
+        <w:tabs>
+          <w:tab w:val="num" w:pos="2880"/>
+        </w:tabs>
+        <w:ind w:left="2880" w:hanging="360"/>
+      </w:pPr>
+      <w:rPr>
+        <w:rFonts w:ascii="Wingdings" w:hAnsi="Wingdings" w:hint="default"/>
+        <w:sz w:val="20"/>
+      </w:rPr>
+    </w:lvl>
+    <w:lvl w:ilvl="4" w:tentative="1">
+      <w:start w:val="1"/>
+      <w:numFmt w:val="bullet"/>
+      <w:lvlText w:val=""/>
+      <w:lvlJc w:val="left"/>
+      <w:pPr>
+        <w:tabs>
+          <w:tab w:val="num" w:pos="3600"/>
+        </w:tabs>
+        <w:ind w:left="3600" w:hanging="360"/>
+      </w:pPr>
+      <w:rPr>
+        <w:rFonts w:ascii="Wingdings" w:hAnsi="Wingdings" w:hint="default"/>
+        <w:sz w:val="20"/>
+      </w:rPr>
+    </w:lvl>
+    <w:lvl w:ilvl="5" w:tentative="1">
+      <w:start w:val="1"/>
+      <w:numFmt w:val="bullet"/>
+      <w:lvlText w:val=""/>
+      <w:lvlJc w:val="left"/>
+      <w:pPr>
+        <w:tabs>
+          <w:tab w:val="num" w:pos="4320"/>
+        </w:tabs>
+        <w:ind w:left="4320" w:hanging="360"/>
+      </w:pPr>
+      <w:rPr>
+        <w:rFonts w:ascii="Wingdings" w:hAnsi="Wingdings" w:hint="default"/>
+        <w:sz w:val="20"/>
+      </w:rPr>
+    </w:lvl>
+    <w:lvl w:ilvl="6" w:tentative="1">
+      <w:start w:val="1"/>
+      <w:numFmt w:val="bullet"/>
+      <w:lvlText w:val=""/>
+      <w:lvlJc w:val="left"/>
+      <w:pPr>
+        <w:tabs>
+          <w:tab w:val="num" w:pos="5040"/>
+        </w:tabs>
+        <w:ind w:left="5040" w:hanging="360"/>
+      </w:pPr>
+      <w:rPr>
+        <w:rFonts w:ascii="Wingdings" w:hAnsi="Wingdings" w:hint="default"/>
+        <w:sz w:val="20"/>
+      </w:rPr>
+    </w:lvl>
+    <w:lvl w:ilvl="7" w:tentative="1">
+      <w:start w:val="1"/>
+      <w:numFmt w:val="bullet"/>
+      <w:lvlText w:val=""/>
+      <w:lvlJc w:val="left"/>
+      <w:pPr>
+        <w:tabs>
+          <w:tab w:val="num" w:pos="5760"/>
+        </w:tabs>
+        <w:ind w:left="5760" w:hanging="360"/>
+      </w:pPr>
+      <w:rPr>
+        <w:rFonts w:ascii="Wingdings" w:hAnsi="Wingdings" w:hint="default"/>
+        <w:sz w:val="20"/>
+      </w:rPr>
+    </w:lvl>
+    <w:lvl w:ilvl="8" w:tentative="1">
+      <w:start w:val="1"/>
+      <w:numFmt w:val="bullet"/>
+      <w:lvlText w:val=""/>
+      <w:lvlJc w:val="left"/>
+      <w:pPr>
+        <w:tabs>
+          <w:tab w:val="num" w:pos="6480"/>
+        </w:tabs>
+        <w:ind w:left="6480" w:hanging="360"/>
+      </w:pPr>
+      <w:rPr>
+        <w:rFonts w:ascii="Wingdings" w:hAnsi="Wingdings" w:hint="default"/>
+        <w:sz w:val="20"/>
+      </w:rPr>
+    </w:lvl>
+  </w:abstractNum>
+  <w:abstractNum w:abstractNumId="1" w15:restartNumberingAfterBreak="0">
     <w:nsid w:val="15145751"/>
     <w:multiLevelType w:val="hybridMultilevel"/>
     <w:tmpl w:val="20F47FF8"/>
@@ -10149,7 +10395,7 @@
       </w:rPr>
     </w:lvl>
   </w:abstractNum>
-  <w:abstractNum w:abstractNumId="1" w15:restartNumberingAfterBreak="0">
+  <w:abstractNum w:abstractNumId="2" w15:restartNumberingAfterBreak="0">
     <w:nsid w:val="1EE0318D"/>
     <w:multiLevelType w:val="hybridMultilevel"/>
     <w:tmpl w:val="5CACB296"/>
@@ -10262,7 +10508,7 @@
       </w:rPr>
     </w:lvl>
   </w:abstractNum>
-  <w:abstractNum w:abstractNumId="2" w15:restartNumberingAfterBreak="0">
+  <w:abstractNum w:abstractNumId="3" w15:restartNumberingAfterBreak="0">
     <w:nsid w:val="24C97EB3"/>
     <w:multiLevelType w:val="multilevel"/>
     <w:tmpl w:val="D770A550"/>
@@ -10375,7 +10621,7 @@
       </w:rPr>
     </w:lvl>
   </w:abstractNum>
-  <w:abstractNum w:abstractNumId="3" w15:restartNumberingAfterBreak="0">
+  <w:abstractNum w:abstractNumId="4" w15:restartNumberingAfterBreak="0">
     <w:nsid w:val="2B4771FA"/>
     <w:multiLevelType w:val="multilevel"/>
     <w:tmpl w:val="9176012E"/>
@@ -10524,10 +10770,159 @@
       </w:rPr>
     </w:lvl>
   </w:abstractNum>
-  <w:abstractNum w:abstractNumId="4" w15:restartNumberingAfterBreak="0">
+  <w:abstractNum w:abstractNumId="5" w15:restartNumberingAfterBreak="0">
+    <w:nsid w:val="3EBA1413"/>
+    <w:multiLevelType w:val="multilevel"/>
+    <w:tmpl w:val="8494B33C"/>
+    <w:lvl w:ilvl="0">
+      <w:start w:val="1"/>
+      <w:numFmt w:val="bullet"/>
+      <w:lvlText w:val=""/>
+      <w:lvlJc w:val="left"/>
+      <w:pPr>
+        <w:tabs>
+          <w:tab w:val="num" w:pos="720"/>
+        </w:tabs>
+        <w:ind w:left="720" w:hanging="360"/>
+      </w:pPr>
+      <w:rPr>
+        <w:rFonts w:ascii="Symbol" w:hAnsi="Symbol" w:hint="default"/>
+        <w:sz w:val="20"/>
+      </w:rPr>
+    </w:lvl>
+    <w:lvl w:ilvl="1" w:tentative="1">
+      <w:start w:val="1"/>
+      <w:numFmt w:val="bullet"/>
+      <w:lvlText w:val="o"/>
+      <w:lvlJc w:val="left"/>
+      <w:pPr>
+        <w:tabs>
+          <w:tab w:val="num" w:pos="1440"/>
+        </w:tabs>
+        <w:ind w:left="1440" w:hanging="360"/>
+      </w:pPr>
+      <w:rPr>
+        <w:rFonts w:ascii="Courier New" w:hAnsi="Courier New" w:hint="default"/>
+        <w:sz w:val="20"/>
+      </w:rPr>
+    </w:lvl>
+    <w:lvl w:ilvl="2" w:tentative="1">
+      <w:start w:val="1"/>
+      <w:numFmt w:val="bullet"/>
+      <w:lvlText w:val=""/>
+      <w:lvlJc w:val="left"/>
+      <w:pPr>
+        <w:tabs>
+          <w:tab w:val="num" w:pos="2160"/>
+        </w:tabs>
+        <w:ind w:left="2160" w:hanging="360"/>
+      </w:pPr>
+      <w:rPr>
+        <w:rFonts w:ascii="Wingdings" w:hAnsi="Wingdings" w:hint="default"/>
+        <w:sz w:val="20"/>
+      </w:rPr>
+    </w:lvl>
+    <w:lvl w:ilvl="3" w:tentative="1">
+      <w:start w:val="1"/>
+      <w:numFmt w:val="bullet"/>
+      <w:lvlText w:val=""/>
+      <w:lvlJc w:val="left"/>
+      <w:pPr>
+        <w:tabs>
+          <w:tab w:val="num" w:pos="2880"/>
+        </w:tabs>
+        <w:ind w:left="2880" w:hanging="360"/>
+      </w:pPr>
+      <w:rPr>
+        <w:rFonts w:ascii="Wingdings" w:hAnsi="Wingdings" w:hint="default"/>
+        <w:sz w:val="20"/>
+      </w:rPr>
+    </w:lvl>
+    <w:lvl w:ilvl="4" w:tentative="1">
+      <w:start w:val="1"/>
+      <w:numFmt w:val="bullet"/>
+      <w:lvlText w:val=""/>
+      <w:lvlJc w:val="left"/>
+      <w:pPr>
+        <w:tabs>
+          <w:tab w:val="num" w:pos="3600"/>
+        </w:tabs>
+        <w:ind w:left="3600" w:hanging="360"/>
+      </w:pPr>
+      <w:rPr>
+        <w:rFonts w:ascii="Wingdings" w:hAnsi="Wingdings" w:hint="default"/>
+        <w:sz w:val="20"/>
+      </w:rPr>
+    </w:lvl>
+    <w:lvl w:ilvl="5" w:tentative="1">
+      <w:start w:val="1"/>
+      <w:numFmt w:val="bullet"/>
+      <w:lvlText w:val=""/>
+      <w:lvlJc w:val="left"/>
+      <w:pPr>
+        <w:tabs>
+          <w:tab w:val="num" w:pos="4320"/>
+        </w:tabs>
+        <w:ind w:left="4320" w:hanging="360"/>
+      </w:pPr>
+      <w:rPr>
+        <w:rFonts w:ascii="Wingdings" w:hAnsi="Wingdings" w:hint="default"/>
+        <w:sz w:val="20"/>
+      </w:rPr>
+    </w:lvl>
+    <w:lvl w:ilvl="6" w:tentative="1">
+      <w:start w:val="1"/>
+      <w:numFmt w:val="bullet"/>
+      <w:lvlText w:val=""/>
+      <w:lvlJc w:val="left"/>
+      <w:pPr>
+        <w:tabs>
+          <w:tab w:val="num" w:pos="5040"/>
+        </w:tabs>
+        <w:ind w:left="5040" w:hanging="360"/>
+      </w:pPr>
+      <w:rPr>
+        <w:rFonts w:ascii="Wingdings" w:hAnsi="Wingdings" w:hint="default"/>
+        <w:sz w:val="20"/>
+      </w:rPr>
+    </w:lvl>
+    <w:lvl w:ilvl="7" w:tentative="1">
+      <w:start w:val="1"/>
+      <w:numFmt w:val="bullet"/>
+      <w:lvlText w:val=""/>
+      <w:lvlJc w:val="left"/>
+      <w:pPr>
+        <w:tabs>
+          <w:tab w:val="num" w:pos="5760"/>
+        </w:tabs>
+        <w:ind w:left="5760" w:hanging="360"/>
+      </w:pPr>
+      <w:rPr>
+        <w:rFonts w:ascii="Wingdings" w:hAnsi="Wingdings" w:hint="default"/>
+        <w:sz w:val="20"/>
+      </w:rPr>
+    </w:lvl>
+    <w:lvl w:ilvl="8" w:tentative="1">
+      <w:start w:val="1"/>
+      <w:numFmt w:val="bullet"/>
+      <w:lvlText w:val=""/>
+      <w:lvlJc w:val="left"/>
+      <w:pPr>
+        <w:tabs>
+          <w:tab w:val="num" w:pos="6480"/>
+        </w:tabs>
+        <w:ind w:left="6480" w:hanging="360"/>
+      </w:pPr>
+      <w:rPr>
+        <w:rFonts w:ascii="Wingdings" w:hAnsi="Wingdings" w:hint="default"/>
+        <w:sz w:val="20"/>
+      </w:rPr>
+    </w:lvl>
+  </w:abstractNum>
+  <w:abstractNum w:abstractNumId="6" w15:restartNumberingAfterBreak="0">
     <w:nsid w:val="62C32EF4"/>
     <w:multiLevelType w:val="hybridMultilevel"/>
-    <w:tmpl w:val="0A085576"/>
+    <w:tmpl w:val="D19A8984"/>
     <w:lvl w:ilvl="0" w:tplc="08090001">
       <w:start w:val="1"/>
       <w:numFmt w:val="bullet"/>
@@ -10637,7 +11032,7 @@
       </w:rPr>
     </w:lvl>
   </w:abstractNum>
-  <w:abstractNum w:abstractNumId="5" w15:restartNumberingAfterBreak="0">
+  <w:abstractNum w:abstractNumId="7" w15:restartNumberingAfterBreak="0">
     <w:nsid w:val="6BF73663"/>
     <w:multiLevelType w:val="hybridMultilevel"/>
     <w:tmpl w:val="89DC5F80"/>
@@ -10724,22 +11119,28 @@
     </w:lvl>
   </w:abstractNum>
   <w:num w:numId="1" w16cid:durableId="760874054">
+    <w:abstractNumId w:val="3"/>
+  </w:num>
+  <w:num w:numId="2" w16cid:durableId="1970479368">
+    <w:abstractNumId w:val="7"/>
+  </w:num>
+  <w:num w:numId="3" w16cid:durableId="37434908">
     <w:abstractNumId w:val="2"/>
   </w:num>
-  <w:num w:numId="2" w16cid:durableId="1970479368">
+  <w:num w:numId="4" w16cid:durableId="918055279">
+    <w:abstractNumId w:val="1"/>
+  </w:num>
+  <w:num w:numId="5" w16cid:durableId="1307667314">
+    <w:abstractNumId w:val="4"/>
+  </w:num>
+  <w:num w:numId="6" w16cid:durableId="2028023526">
+    <w:abstractNumId w:val="6"/>
+  </w:num>
+  <w:num w:numId="7" w16cid:durableId="1587304457">
     <w:abstractNumId w:val="5"/>
   </w:num>
-  <w:num w:numId="3" w16cid:durableId="37434908">
-    <w:abstractNumId w:val="1"/>
-  </w:num>
-  <w:num w:numId="4" w16cid:durableId="918055279">
+  <w:num w:numId="8" w16cid:durableId="444278796">
     <w:abstractNumId w:val="0"/>
-  </w:num>
-  <w:num w:numId="5" w16cid:durableId="1307667314">
-    <w:abstractNumId w:val="3"/>
-  </w:num>
-  <w:num w:numId="6" w16cid:durableId="2028023526">
-    <w:abstractNumId w:val="4"/>
   </w:num>
   <w:numIdMacAtCleanup w:val="4"/>
 </w:numbering>
@@ -11427,7 +11828,7 @@
   </w:style>
   <w:style w:type="paragraph" w:styleId="ListParagraph">
     <w:name w:val="List Paragraph"/>
-    <w:aliases w:val="Bullet List,FooterText"/>
+    <w:aliases w:val="Bullet List,FooterText,FooterTextCxSpLast"/>
     <w:basedOn w:val="Normal"/>
     <w:link w:val="ListParagraphChar"/>
     <w:uiPriority w:val="34"/>
@@ -11565,10 +11966,9 @@
   </w:style>
   <w:style w:type="character" w:customStyle="1" w:styleId="ListParagraphChar">
     <w:name w:val="List Paragraph Char"/>
-    <w:aliases w:val="Bullet List Char,FooterText Char"/>
+    <w:aliases w:val="Bullet List Char,FooterText Char,FooterTextCxSpLast Char"/>
     <w:basedOn w:val="DefaultParagraphFont"/>
     <w:link w:val="ListParagraph"/>
-    <w:uiPriority w:val="34"/>
     <w:locked/>
     <w:rsid w:val="00FF1FB1"/>
     <w:rPr>

</xml_diff>